<commit_message>
Add some labs and smth else
</commit_message>
<xml_diff>
--- a/drive/1lab/1labreport.docx
+++ b/drive/1lab/1labreport.docx
@@ -976,15 +976,7 @@
         <w:t xml:space="preserve">с </w:t>
       </w:r>
       <w:r>
-        <w:t xml:space="preserve">постоянными магнитами на примере симуляции в </w:t>
-      </w:r>
-      <w:proofErr w:type="spellStart"/>
-      <w:r>
-        <w:t>SimInTech</w:t>
-      </w:r>
-      <w:proofErr w:type="spellEnd"/>
-      <w:r>
-        <w:t>.</w:t>
+        <w:t>постоянными магнитами на примере симуляции в SimInTech.</w:t>
       </w:r>
     </w:p>
     <w:p>
@@ -1052,21 +1044,7 @@
         <w:rPr>
           <w:sz w:val="28"/>
         </w:rPr>
-        <w:t xml:space="preserve">Составить модель СДПМ в </w:t>
-      </w:r>
-      <w:proofErr w:type="spellStart"/>
-      <w:r>
-        <w:rPr>
-          <w:sz w:val="28"/>
-        </w:rPr>
-        <w:t>SimInTech</w:t>
-      </w:r>
-      <w:proofErr w:type="spellEnd"/>
-      <w:r>
-        <w:rPr>
-          <w:sz w:val="28"/>
-        </w:rPr>
-        <w:t>. В отчет вставить скриншот модели и уравнения, по которым модель была построена.</w:t>
+        <w:t>Составить модель СДПМ в SimInTech. В отчет вставить скриншот модели и уравнения, по которым модель была построена.</w:t>
       </w:r>
     </w:p>
     <w:p>
@@ -1711,21 +1689,7 @@
         <w:rPr>
           <w:sz w:val="28"/>
         </w:rPr>
-        <w:t xml:space="preserve">Построить модель </w:t>
-      </w:r>
-      <w:proofErr w:type="spellStart"/>
-      <w:r>
-        <w:rPr>
-          <w:sz w:val="28"/>
-        </w:rPr>
-        <w:t>полеориентированного</w:t>
-      </w:r>
-      <w:proofErr w:type="spellEnd"/>
-      <w:r>
-        <w:rPr>
-          <w:sz w:val="28"/>
-        </w:rPr>
-        <w:t xml:space="preserve"> управления СДПМ. В отчет вставить скриншот модели, график скорости при задании номинальной скорости.</w:t>
+        <w:t>Построить модель полеориентированного управления СДПМ. В отчет вставить скриншот модели, график скорости при задании номинальной скорости.</w:t>
       </w:r>
     </w:p>
     <w:p>
@@ -1745,21 +1709,7 @@
         <w:rPr>
           <w:sz w:val="28"/>
         </w:rPr>
-        <w:t xml:space="preserve">Добавить в модель </w:t>
-      </w:r>
-      <w:proofErr w:type="spellStart"/>
-      <w:r>
-        <w:rPr>
-          <w:sz w:val="28"/>
-        </w:rPr>
-        <w:t>полеориентированного</w:t>
-      </w:r>
-      <w:proofErr w:type="spellEnd"/>
-      <w:r>
-        <w:rPr>
-          <w:sz w:val="28"/>
-        </w:rPr>
-        <w:t xml:space="preserve"> управления однополярный ШИМ, (добавить фильтрацию токов, выполнить подбор частоты ШИМ). В отчет вставить</w:t>
+        <w:t>Добавить в модель полеориентированного управления однополярный ШИМ, (добавить фильтрацию токов, выполнить подбор частоты ШИМ). В отчет вставить</w:t>
       </w:r>
       <w:r>
         <w:rPr>
@@ -2182,21 +2132,12 @@
               </w:rPr>
               <w:t>М</w:t>
             </w:r>
-            <w:proofErr w:type="spellStart"/>
             <w:r>
               <w:rPr>
                 <w:spacing w:val="-4"/>
                 <w:sz w:val="14"/>
               </w:rPr>
-              <w:t>max</w:t>
-            </w:r>
-            <w:proofErr w:type="spellEnd"/>
-            <w:r>
-              <w:rPr>
-                <w:spacing w:val="-4"/>
-                <w:sz w:val="14"/>
-              </w:rPr>
-              <w:t>,</w:t>
+              <w:t>max,</w:t>
             </w:r>
             <w:r>
               <w:rPr>
@@ -2248,33 +2189,11 @@
               <w:ind w:left="106" w:right="100" w:hanging="5"/>
               <w:jc w:val="center"/>
             </w:pPr>
-            <w:proofErr w:type="spellStart"/>
             <w:r>
               <w:rPr>
                 <w:spacing w:val="-2"/>
               </w:rPr>
-              <w:t>Эффек</w:t>
-            </w:r>
-            <w:proofErr w:type="spellEnd"/>
-            <w:r>
-              <w:rPr>
-                <w:spacing w:val="-2"/>
-              </w:rPr>
-              <w:t xml:space="preserve">- </w:t>
-            </w:r>
-            <w:proofErr w:type="spellStart"/>
-            <w:r>
-              <w:rPr>
-                <w:spacing w:val="-2"/>
-              </w:rPr>
-              <w:t>тивность</w:t>
-            </w:r>
-            <w:proofErr w:type="spellEnd"/>
-            <w:r>
-              <w:rPr>
-                <w:spacing w:val="-2"/>
-              </w:rPr>
-              <w:t>,</w:t>
+              <w:t>Эффек- тивность,</w:t>
             </w:r>
           </w:p>
           <w:p>
@@ -2366,19 +2285,11 @@
               <w:spacing w:before="188" w:line="360" w:lineRule="auto"/>
               <w:ind w:left="106" w:right="88" w:firstLine="4"/>
             </w:pPr>
-            <w:proofErr w:type="spellStart"/>
             <w:r>
               <w:rPr>
                 <w:spacing w:val="-4"/>
               </w:rPr>
-              <w:t>Rs</w:t>
-            </w:r>
-            <w:proofErr w:type="spellEnd"/>
-            <w:r>
-              <w:rPr>
-                <w:spacing w:val="-4"/>
-              </w:rPr>
-              <w:t xml:space="preserve">, </w:t>
+              <w:t xml:space="preserve">Rs, </w:t>
             </w:r>
             <w:r>
               <w:rPr>
@@ -2398,28 +2309,18 @@
               <w:spacing w:before="188" w:line="360" w:lineRule="auto"/>
               <w:ind w:left="107" w:firstLine="9"/>
             </w:pPr>
-            <w:proofErr w:type="spellStart"/>
             <w:r>
               <w:rPr>
                 <w:spacing w:val="-4"/>
               </w:rPr>
-              <w:t>Lm</w:t>
+              <w:t xml:space="preserve">Lm, </w:t>
             </w:r>
-            <w:proofErr w:type="spellEnd"/>
-            <w:r>
-              <w:rPr>
-                <w:spacing w:val="-4"/>
-              </w:rPr>
-              <w:t xml:space="preserve">, </w:t>
-            </w:r>
-            <w:proofErr w:type="spellStart"/>
             <w:r>
               <w:rPr>
                 <w:spacing w:val="-5"/>
               </w:rPr>
               <w:t>мГн</w:t>
             </w:r>
-            <w:proofErr w:type="spellEnd"/>
           </w:p>
         </w:tc>
         <w:tc>
@@ -2445,14 +2346,12 @@
               <w:spacing w:before="126"/>
               <w:ind w:left="107"/>
             </w:pPr>
-            <w:proofErr w:type="spellStart"/>
             <w:r>
               <w:rPr>
                 <w:spacing w:val="-5"/>
               </w:rPr>
               <w:t>мГн</w:t>
             </w:r>
-            <w:proofErr w:type="spellEnd"/>
           </w:p>
         </w:tc>
         <w:tc>
@@ -2945,21 +2844,7 @@
         <w:rPr>
           <w:spacing w:val="-2"/>
         </w:rPr>
-        <w:t xml:space="preserve">На основе уравнений сделаем </w:t>
-      </w:r>
-      <w:proofErr w:type="spellStart"/>
-      <w:r>
-        <w:rPr>
-          <w:spacing w:val="-2"/>
-        </w:rPr>
-        <w:t>субмодель</w:t>
-      </w:r>
-      <w:proofErr w:type="spellEnd"/>
-      <w:r>
-        <w:rPr>
-          <w:spacing w:val="-2"/>
-        </w:rPr>
-        <w:t xml:space="preserve"> СДПМ. Данный тип двигателя описывается уравнениями в подвижных осях A, B, C.</w:t>
+        <w:t>На основе уравнений сделаем субмодель СДПМ. Данный тип двигателя описывается уравнениями в подвижных осях A, B, C.</w:t>
       </w:r>
     </w:p>
     <w:p>
@@ -3904,21 +3789,7 @@
         <w:rPr>
           <w:spacing w:val="-2"/>
         </w:rPr>
-        <w:t xml:space="preserve">Модель, составленная в </w:t>
-      </w:r>
-      <w:proofErr w:type="spellStart"/>
-      <w:r>
-        <w:rPr>
-          <w:spacing w:val="-2"/>
-        </w:rPr>
-        <w:t>SimInTech</w:t>
-      </w:r>
-      <w:proofErr w:type="spellEnd"/>
-      <w:r>
-        <w:rPr>
-          <w:spacing w:val="-2"/>
-        </w:rPr>
-        <w:t xml:space="preserve"> приведена на рисунке 1.</w:t>
+        <w:t>Модель, составленная в SimInTech приведена на рисунке 1.</w:t>
       </w:r>
     </w:p>
     <w:p>
@@ -5165,7 +5036,7 @@
         <w:rPr>
           <w:spacing w:val="-2"/>
         </w:rPr>
-        <w:t>и обратного преобразования Кларка. Составим блоки преобразования, скрипты описывающие данные блоки приведены на рисунках 8 и 9.</w:t>
+        <w:t>и обратного преобразования Кларк. Составим блоки преобразования, скрипты описывающие данные блоки приведены на рисунках 8 и 9.</w:t>
       </w:r>
     </w:p>
     <w:p>
@@ -5500,7 +5371,7 @@
         <w:rPr>
           <w:noProof/>
         </w:rPr>
-        <w:t xml:space="preserve"> Кларка</w:t>
+        <w:t xml:space="preserve"> Кларк</w:t>
       </w:r>
     </w:p>
     <w:p>
@@ -6280,21 +6151,7 @@
         <w:rPr>
           <w:spacing w:val="-2"/>
         </w:rPr>
-        <w:t xml:space="preserve">Для добавления регулятора скорости необходимо добавить в модель блоки прямого преобразования Парка и прямого преобразования Кларка, как это было сделано в предыдущем пункте (рисунки 13 и 14). Регулятор скорости представляет из себя библиотечный ПИ регулятор с ограничением по вектору </w:t>
-      </w:r>
-      <w:proofErr w:type="spellStart"/>
-      <w:r>
-        <w:rPr>
-          <w:spacing w:val="-2"/>
-        </w:rPr>
-        <w:t>ud</w:t>
-      </w:r>
-      <w:proofErr w:type="spellEnd"/>
-      <w:r>
-        <w:rPr>
-          <w:spacing w:val="-2"/>
-        </w:rPr>
-        <w:t>.</w:t>
+        <w:t>Для добавления регулятора скорости необходимо добавить в модель блоки прямого преобразования Парка и прямого преобразования Кларк, как это было сделано в предыдущем пункте (рисунки 13 и 14). Регулятор скорости представляет из себя библиотечный ПИ регулятор с ограничением по вектору ud.</w:t>
       </w:r>
     </w:p>
     <w:p>
@@ -6454,13 +6311,12 @@
         <w:rPr>
           <w:noProof/>
         </w:rPr>
-        <w:t xml:space="preserve"> Кларка</w:t>
-      </w:r>
-    </w:p>
-    <w:p>
-      <w:pPr>
-        <w:pStyle w:val="a3"/>
-        <w:jc w:val="center"/>
+        <w:t xml:space="preserve"> Кларк</w:t>
+      </w:r>
+    </w:p>
+    <w:p>
+      <w:pPr>
+        <w:pStyle w:val="a3"/>
         <w:sectPr>
           <w:pgSz w:w="11910" w:h="16840"/>
           <w:pgMar w:top="1700" w:right="425" w:bottom="1340" w:left="1133" w:header="0" w:footer="1153" w:gutter="0"/>
@@ -6791,16 +6647,8 @@
         <w:rPr>
           <w:noProof/>
         </w:rPr>
-        <w:t xml:space="preserve"> </w:t>
-      </w:r>
-      <w:proofErr w:type="spellStart"/>
-      <w:r>
-        <w:rPr>
-          <w:noProof/>
-        </w:rPr>
-        <w:t>U_lim</w:t>
-      </w:r>
-      <w:proofErr w:type="spellEnd"/>
+        <w:t xml:space="preserve"> U_lim</w:t>
+      </w:r>
     </w:p>
     <w:p>
       <w:pPr>
@@ -7119,21 +6967,7 @@
         <w:rPr>
           <w:spacing w:val="-2"/>
         </w:rPr>
-        <w:t xml:space="preserve">Полученные коэффициенты составили </w:t>
-      </w:r>
-      <w:proofErr w:type="spellStart"/>
-      <w:r>
-        <w:rPr>
-          <w:spacing w:val="-2"/>
-        </w:rPr>
-        <w:t>Kp</w:t>
-      </w:r>
-      <w:proofErr w:type="spellEnd"/>
-      <w:r>
-        <w:rPr>
-          <w:spacing w:val="-2"/>
-        </w:rPr>
-        <w:t xml:space="preserve"> = </w:t>
+        <w:t xml:space="preserve">Полученные коэффициенты составили Kp = </w:t>
       </w:r>
       <w:r>
         <w:rPr>
@@ -7145,21 +6979,7 @@
         <w:rPr>
           <w:spacing w:val="-2"/>
         </w:rPr>
-        <w:t xml:space="preserve">, </w:t>
-      </w:r>
-      <w:proofErr w:type="spellStart"/>
-      <w:r>
-        <w:rPr>
-          <w:spacing w:val="-2"/>
-        </w:rPr>
-        <w:t>Ki</w:t>
-      </w:r>
-      <w:proofErr w:type="spellEnd"/>
-      <w:r>
-        <w:rPr>
-          <w:spacing w:val="-2"/>
-        </w:rPr>
-        <w:t xml:space="preserve"> = 2.5. В таком случае перерегулирование составляет примерно </w:t>
+        <w:t xml:space="preserve">, Ki = 2.5. В таком случае перерегулирование составляет примерно </w:t>
       </w:r>
       <w:r>
         <w:rPr>
@@ -8260,14 +8080,12 @@
         </w:rPr>
         <w:t xml:space="preserve">       </w:t>
       </w:r>
-      <w:proofErr w:type="spellStart"/>
       <w:r>
         <w:rPr>
           <w:spacing w:val="-2"/>
         </w:rPr>
         <w:t>полеориентированное</w:t>
       </w:r>
-      <w:proofErr w:type="spellEnd"/>
       <w:r>
         <w:rPr>
           <w:spacing w:val="-2"/>
@@ -8387,21 +8205,7 @@
         <w:rPr>
           <w:spacing w:val="-2"/>
         </w:rPr>
-        <w:t xml:space="preserve">На рисунке 22 представлена модель </w:t>
-      </w:r>
-      <w:proofErr w:type="spellStart"/>
-      <w:r>
-        <w:rPr>
-          <w:spacing w:val="-2"/>
-        </w:rPr>
-        <w:t>полеориентированного</w:t>
-      </w:r>
-      <w:proofErr w:type="spellEnd"/>
-      <w:r>
-        <w:rPr>
-          <w:spacing w:val="-2"/>
-        </w:rPr>
-        <w:t xml:space="preserve"> управления </w:t>
+        <w:t xml:space="preserve">На рисунке 22 представлена модель полеориентированного управления </w:t>
       </w:r>
       <w:r>
         <w:rPr>
@@ -8521,14 +8325,12 @@
         </w:rPr>
         <w:t xml:space="preserve"> </w:t>
       </w:r>
-      <w:proofErr w:type="spellStart"/>
       <w:r>
         <w:rPr>
           <w:noProof/>
         </w:rPr>
         <w:t>полеориентированного</w:t>
       </w:r>
-      <w:proofErr w:type="spellEnd"/>
       <w:r>
         <w:rPr>
           <w:noProof/>
@@ -9079,28 +8881,13 @@
         <w:jc w:val="both"/>
         <w:rPr>
           <w:spacing w:val="-2"/>
-          <w:lang w:val="en-US"/>
-        </w:rPr>
-      </w:pPr>
-      <w:r>
-        <w:rPr>
-          <w:spacing w:val="-2"/>
-        </w:rPr>
-        <w:t xml:space="preserve">В рамках лабораторной работы было проведено исследование методов управления синхронным двигателем с постоянными магнитами (СДПМ). Анализ прямого пуска от сети показал, что максимальная частота запуска составляет 25 Гц, что в четыре раза ниже номинальной. Были разработаны системы управления на основе преобразований Кларка и Парка. Наиболее простая конфигурация (вентильный двигатель) не обеспечила выход на номинальную скорость в установившемся режиме. Введение регулятора скорости позволило достичь номинальных оборотов, однако сопровождалось перерегулированием в 6%. Последующее добавление регуляторов тока позволило реализовать </w:t>
-      </w:r>
-      <w:proofErr w:type="spellStart"/>
-      <w:r>
-        <w:rPr>
-          <w:spacing w:val="-2"/>
-        </w:rPr>
-        <w:t>полеориентированное</w:t>
-      </w:r>
-      <w:proofErr w:type="spellEnd"/>
-      <w:r>
-        <w:rPr>
-          <w:spacing w:val="-2"/>
-        </w:rPr>
-        <w:t xml:space="preserve"> управление, которое устранило перерегулирование и обеспечило время регулирования 1 с. Интеграция ШИМ-модуляции сократила время переходного процесса до 0,05 с, но привела к установившейся ошибке по скорости.</w:t>
+        </w:rPr>
+      </w:pPr>
+      <w:r>
+        <w:rPr>
+          <w:spacing w:val="-2"/>
+        </w:rPr>
+        <w:t>В рамках лабораторной работы было проведено исследование методов управления синхронным двигателем с постоянными магнитами (СДПМ). Анализ прямого пуска от сети показал, что максимальная частота запуска составляет 25 Гц, что в четыре раза ниже номинальной. Были разработаны системы управления на основе преобразований Кларк и Парка. Наиболее простая конфигурация (вентильный двигатель) не обеспечила выход на номинальную скорость в установившемся режиме. Введение регулятора скорости позволило достичь номинальных оборотов, однако сопровождалось перерегулированием в 6%. Последующее добавление регуляторов тока позволило реализовать полеориентированное управление, которое устранило перерегулирование и обеспечило время регулирования 1 с. Интеграция ШИМ-модуляции сократила время переходного процесса до 0,05 с, но привела к установившейся ошибке по скорости.</w:t>
       </w:r>
     </w:p>
     <w:sectPr>

</xml_diff>